<commit_message>
ajout des grpahes + update Readme
</commit_message>
<xml_diff>
--- a/rapport_bigdata.docx
+++ b/rapport_bigdata.docx
@@ -1581,7 +1581,7 @@
           <w:sz w:val="20"/>
           <w:szCs w:val="20"/>
         </w:rPr>
-        <w:t xml:space="preserve">spark = SparkSession.builder.appName("LeBonCoin-Streaming").config("spark.sql.shuffle.partitions", "4").getOrCreate()</w:t>
+        <w:t>spark = SparkSession.builder.appName("LeBonCoin-Streaming").config("spark.jars.packages", "graphframes:graphframes:0.8.4-spark3.5-s_2.12").config("spark.driver.memory", "2g").config("spark.sql.shuffle.partitions", "4").config("spark.sql.adaptive.enabled", "false").getOrCreate()</w:t>
       </w:r>
     </w:p>
     <w:p>
@@ -1596,15 +1596,20 @@
           <w:sz w:val="22"/>
           <w:szCs w:val="22"/>
         </w:rPr>
-        <w:t xml:space="preserve">Justification de spark.sql.shuffle.partitions = 4 : </w:t>
-      </w:r>
-      <w:r>
-        <w:rPr>
-          <w:rFonts w:ascii="Arial" w:cs="Arial" w:eastAsia="Arial" w:hAnsi="Arial"/>
-          <w:sz w:val="22"/>
-          <w:szCs w:val="22"/>
-        </w:rPr>
-        <w:t xml:space="preserve">Par défaut, Spark crée 200 partitions lors d'un shuffle (opérations groupBy, join). Sur une machine locale mono-nœud, cette valeur est contre-productive et génère une surcharge de planification. La valeur 4 correspond au nombre de cœurs CPU disponibles sur la machine de développement, optimisant ainsi le parallélisme sans overhead inutile.</w:t>
+        <w:t>Justification des configurations :</w:t>
+        <w:br/>
+        <w:t>• spark.sql.shuffle.partitions=4 : Par défaut, Spark crée 200 partitions lors d'un shuffle. Sur une machine locale mono-nœud, la valeur 4 correspond au nombre de cœurs CPU disponibles, optimisant le parallélisme sans overhead inutile.</w:t>
+        <w:br/>
+        <w:t>• spark.driver.memory=2g : GraphFrames utilise l'algorithme Pregel pour connectedComponents() et pageRank(), deux algorithmes itératifs nécessitant plus de mémoire que les opérations standard. 2 Go alloués au Driver garantissent leur exécution sans OutOfMemoryError.</w:t>
+        <w:br/>
+        <w:t>• spark.sql.adaptive.enabled=false : L'Adaptive Query Execution génère des plans d'exécution très verbeux avec GraphFrames, provoquant un OutOfMemoryError lors de leur sérialisation. Sa désactivation stabilise l'exécution sans impact sur les performances dans notre contexte local.</w:t>
+      </w:r>
+      <w:r>
+        <w:rPr>
+          <w:rFonts w:ascii="Arial" w:cs="Arial" w:eastAsia="Arial" w:hAnsi="Arial"/>
+          <w:sz w:val="22"/>
+          <w:szCs w:val="22"/>
+        </w:rPr>
       </w:r>
     </w:p>
     <w:p>
@@ -2910,7 +2915,7 @@
           <w:sz w:val="22"/>
           <w:szCs w:val="22"/>
         </w:rPr>
-        <w:t xml:space="preserve">En conséquence, nous avons implémenté manuellement l'équivalent fonctionnel complet de GraphFrames, en respectant strictement son modèle de données :</w:t>
+        <w:t>GraphFrames est utilisé nativement dans notre pipeline. Après avoir résolu un conflit de version entre Spark 4.x (installation système) et GraphFrames 0.8.4 (compilé pour Scala 2.12), nous utilisons PySpark 3.5.3 via pip qui garantit la compatibilité Scala 2.12. Le JAR GraphFrames est chargé automatiquement via spark.jars.packages au démarrage de la SparkSession.</w:t>
       </w:r>
     </w:p>
     <w:p>
@@ -3344,7 +3349,7 @@
                 <w:sz w:val="20"/>
                 <w:szCs w:val="20"/>
               </w:rPr>
-              <w:t xml:space="preserve">Algorithme Union-Find</w:t>
+              <w:t>GraphFrames natif ✅</w:t>
             </w:r>
           </w:p>
         </w:tc>
@@ -3372,7 +3377,7 @@
                 <w:sz w:val="20"/>
                 <w:szCs w:val="20"/>
               </w:rPr>
-              <w:t xml:space="preserve">✅ Fonctionnellement équivalent</w:t>
+              <w:t>Implémenté ✅</w:t>
             </w:r>
           </w:p>
         </w:tc>
@@ -3611,7 +3616,7 @@
           <w:sz w:val="26"/>
           <w:szCs w:val="26"/>
         </w:rPr>
-        <w:t xml:space="preserve">4.4 Algorithme Union-Find (Composantes Connexes)</w:t>
+        <w:t>4.4 Algorithme GraphFrames — connectedComponents() et pageRank()</w:t>
       </w:r>
     </w:p>
     <w:p>
@@ -3624,7 +3629,13 @@
           <w:sz w:val="22"/>
           <w:szCs w:val="22"/>
         </w:rPr>
-        <w:t xml:space="preserve">L'algorithme Union-Find (aussi appelé Disjoint Set Union) calcule les composantes connexes du graphe — c'est-à-dire les groupes de nœuds reliés entre eux directement ou indirectement.</w:t>
+        <w:t>GraphFrames fournit deux algorithmes de centralité utilisés dans notre pipeline :</w:t>
+        <w:br/>
+        <w:br/>
+        <w:t>connectedComponents() : identifie les groupes de nœuds reliés directement ou indirectement. La diminution du nombre de composantes au fil du temps indique que le graphe devient plus interconnecté.</w:t>
+        <w:br/>
+        <w:br/>
+        <w:t>pageRank(resetProbability=0.15, maxIter=3) : calcule l'importance relative de chaque nœud. Un nœud avec un PageRank élevé est celui vers lequel convergent le plus d'interactions — typiquement un produit très convoité ou un vendeur très actif. Ce score est persisté dans le JSON et utilisé pour dimensionner visuellement les nœuds dans le dashboard.</w:t>
       </w:r>
     </w:p>
     <w:p>
@@ -4791,7 +4802,7 @@
           <w:sz w:val="22"/>
           <w:szCs w:val="22"/>
         </w:rPr>
-        <w:t xml:space="preserve">Le modèle de graphe implémenté — bien que sans la bibliothèque GraphFrames (incompatible avec PySpark 4.1.2) — respecte fidèlement le modèle vertices/edges de GraphFrames et y ajoute le calcul des composantes connexes via l'algorithme Union-Find.</w:t>
+        <w:t>Le modèle de graphe implémenté utilise la bibliothèque GraphFrames (0.8.4-spark3.5-s_2.12) avec ses deux algorithmes principaux : connectedComponents() pour identifier les groupes d'entités interconnectées, et pageRank() pour mesurer l'importance relative de chaque nœud. Le score PageRank est visualisé directement dans le dashboard via la taille des nœuds.</w:t>
       </w:r>
     </w:p>
     <w:p>

</xml_diff>